<commit_message>
docs: añadir corrección de consola silenciosa al arranque a v1.2.0
novedades.txt: nueva entrada en Correcciones — «Mensajes de arranque
silenciados» explica que NVDA ya no verbaliza la ruta del log ni la
detección de ffmpeg al abrir la app desde INICIAR_APP.bat.

Doc 1, 2 y 3: ítem añadido al bloque v1.2.0 de cada documento, con el
nivel de detalle apropiado para el tono de cada uno (personal, técnico
y público respectivamente).

https://claude.ai/code/session_01RAE8Yzngh91mfi44zWCrKb
</commit_message>
<xml_diff>
--- a/documentos/Fases_Del_Proyecto/Documento 1 – Visión Personal Del Proyecto (versión Completa).docx
+++ b/documentos/Fases_Del_Proyecto/Documento 1 – Visión Personal Del Proyecto (versión Completa).docx
@@ -1988,6 +1988,18 @@
       </w:pPr>
       <w:r>
         <w:t>Lectura continua sin pausas entre fragmentos en la nube.</w:t>
+      </w:r>
+    </w:p>
+    <w:p>
+      <w:pPr>
+        <w:pStyle w:val="Compact"/>
+        <w:numPr>
+          <w:ilvl w:val="0"/>
+          <w:numId w:val="1011"/>
+        </w:numPr>
+      </w:pPr>
+      <w:r>
+        <w:t>Mensajes de arranque silenciados: NVDA ya no verbaliza textos técnicos de la consola al abrir la app.</w:t>
       </w:r>
     </w:p>
     <w:p>

</xml_diff>

<commit_message>
docs: documenta gestor_backups.py y completa huecos en DEVELOPMENT.md
Añade la función de copias de seguridad automáticas de proyectos.json
(gestor_backups.py) a todos los lugares donde debía aparecer:
- novedades.txt: nueva entrada en v1.2.0 Nuevas funciones
- CLAUDE.md: gestor_backups.py añadido al árbol motor/
- DEVELOPMENT.md: nueva sección en Registro técnico v1.2, más
  cliente_deepgram.py y diccionario_pronunciacion.py en el árbol de
  archivos, Deepgram en la tabla del stack, nivel de consola corregido
  a WARNING
- Documento 1, 2 y 3: bullet de backups insertado al final del bloque v1.2
</commit_message>
<xml_diff>
--- a/documentos/Fases_Del_Proyecto/Documento 1 – Visión Personal Del Proyecto (versión Completa).docx
+++ b/documentos/Fases_Del_Proyecto/Documento 1 – Visión Personal Del Proyecto (versión Completa).docx
@@ -2000,6 +2000,18 @@
       </w:pPr>
       <w:r>
         <w:t>Mensajes de arranque silenciados: NVDA ya no verbaliza textos técnicos de la consola al abrir la app.</w:t>
+      </w:r>
+    </w:p>
+    <w:p>
+      <w:pPr>
+        <w:pStyle w:val="Compact"/>
+        <w:numPr>
+          <w:ilvl w:val="0"/>
+          <w:numId w:val="1011"/>
+        </w:numPr>
+      </w:pPr>
+      <w:r>
+        <w:t xml:space="preserve">Copias de seguridad automáticas de proyectos: la app guarda en backups/ un ZIP con el estado de proyectos.json cada vez que se modifica el árbol de proyectos. Se conservan las últimas 5 copias.</w:t>
       </w:r>
     </w:p>
     <w:p>

</xml_diff>